<commit_message>
Merge Chapter 2 sections 2.2 and 2.3, and renumber the rest.
Domain Case Study and Web Based System become one section, so the existing
systems section moves into the 2.3 slot with the title the user asked for and
everything after it moves forward by one.

The numbers in this document are literal run text ('2.2' plus a tab), not
automatic numbering, which an earlier attempt assumed and which produced
headings with no number at all. The script therefore strips the literal number
from every heading, deletes the Web Based System heading, and writes 2.1 to 2.6
back in document order. The heading is the only element removed: all 54 body
paragraphs survive in their original order.
</commit_message>
<xml_diff>
--- a/thesis/Chapter2 - PSM Assessment System v2.docx
+++ b/thesis/Chapter2 - PSM Assessment System v2.docx
@@ -120,7 +120,7 @@
           <w:i w:val="0"/>
           <w:sz w:val="24"/>
         </w:rPr>
-        <w:t>Domain Case Study: PSM Assessment System</w:t>
+        <w:t>Domain Case Study and Web Based System</w:t>
       </w:r>
     </w:p>
     <w:p>
@@ -166,6 +166,51 @@
           <w:sz w:val="24"/>
         </w:rPr>
         <w:t>Manual administration of this kind has been reported to cause time consuming task tracking, inefficient communication and delays in project administering (Arumugam &amp; Abd Ishak, 2025), which produces resource wastage, faults in manual assessment data and delay in providing results (Che Adnan &amp; Hafit, 2025), as well as mismatches between student research and supervisor expertise (Borhanuddin &amp; Mohamed, 2023; Tam &amp; Abdullah, 2025). Therefore, a new system is necessary to centralise the entire PSM lifecycle. This will improve visibility of progress and remove the administrative burden produced by manual processes, replacing disconnected manual processes with one authoritative record (Arumugam &amp; Abd Ishak, 2025).</w:t>
+      </w:r>
+    </w:p>
+    <w:p>
+      <w:pPr>
+        <w:spacing w:line="360" w:lineRule="auto" w:before="0" w:after="0"/>
+        <w:jc w:val="both"/>
+      </w:pPr>
+      <w:r>
+        <w:rPr>
+          <w:rFonts w:ascii="Times New Roman" w:hAnsi="Times New Roman" w:eastAsia="Times New Roman"/>
+          <w:b w:val="0"/>
+          <w:i w:val="0"/>
+          <w:sz w:val="24"/>
+        </w:rPr>
+        <w:t>The proposed system is developed as a web based application using modern technologies such as a stateless application programming interface, a relational database and a browser based front end. It follows the same web based approach that comparable faculty systems adopted when they replaced manual handling with an online platform (Arumugam &amp; Abd Ishak, 2025; Wan Fauzi &amp; Alduais, 2025). The system adopts an object oriented approach to ensure modularity and maintainability. A web application is defined as a software program that runs on a web server and is accessed through a web browser over the Internet or an intranet, rather than being installed on a local computer (CIO Wiki, 2023).</w:t>
+      </w:r>
+    </w:p>
+    <w:p>
+      <w:pPr>
+        <w:spacing w:line="360" w:lineRule="auto" w:before="0" w:after="0"/>
+        <w:jc w:val="both"/>
+      </w:pPr>
+      <w:r>
+        <w:rPr>
+          <w:rFonts w:ascii="Times New Roman" w:hAnsi="Times New Roman" w:eastAsia="Times New Roman"/>
+          <w:b w:val="0"/>
+          <w:i w:val="0"/>
+          <w:sz w:val="24"/>
+        </w:rPr>
+        <w:t>The web based approach is chosen because it allows students, supervisors and coordinators to access the same record anytime and anywhere using only a browser. Web applications offer advantages of accessibility, easier maintenance and centralised data, since updates are deployed on the server and are immediately available to all users (CIO Wiki, 2023). These properties are necessary for an administrative process that involves several groups of users, because each group otherwise works from its own copy and no record is authoritative (Arumugam &amp; Abd Ishak, 2025).</w:t>
+      </w:r>
+    </w:p>
+    <w:p>
+      <w:pPr>
+        <w:spacing w:line="360" w:lineRule="auto" w:before="0" w:after="0"/>
+        <w:jc w:val="both"/>
+      </w:pPr>
+      <w:r>
+        <w:rPr>
+          <w:rFonts w:ascii="Times New Roman" w:hAnsi="Times New Roman" w:eastAsia="Times New Roman"/>
+          <w:b w:val="0"/>
+          <w:i w:val="0"/>
+          <w:sz w:val="24"/>
+        </w:rPr>
+        <w:t>The system also applies role based access control, which is a model for controlling access to resources where permitted actions are identified with roles rather than with individual subject identities (NIST, 2022). Role based access is important because a student, a supervisor, an examiner and a coordinator must each hold different permissions over the same PSM record (Arumugam &amp; Abd Ishak, 2025; Wan Fauzi &amp; Alduais, 2025). It also removes the need for the periodic one-to-many announcements that manual coordination relies on when it has no way of addressing a role directly (Chong Er Juan &amp; Wahid, 2021).</w:t>
       </w:r>
     </w:p>
     <w:p>
@@ -194,7 +239,7 @@
           <w:i w:val="0"/>
           <w:sz w:val="24"/>
         </w:rPr>
-        <w:t>Web Based System</w:t>
+        <w:t>Problem Study of Existing Related Systems</w:t>
       </w:r>
     </w:p>
     <w:p>
@@ -209,7 +254,22 @@
           <w:i w:val="0"/>
           <w:sz w:val="24"/>
         </w:rPr>
-        <w:t>The proposed system is developed as a web based application using modern technologies such as a stateless application programming interface, a relational database and a browser based front end. It follows the same web based approach that comparable faculty systems adopted when they replaced manual handling with an online platform (Arumugam &amp; Abd Ishak, 2025; Wan Fauzi &amp; Alduais, 2025). The system adopts an object oriented approach to ensure modularity and maintainability. A web application is defined as a software program that runs on a web server and is accessed through a web browser over the Internet or an intranet, rather than being installed on a local computer (CIO Wiki, 2023).</w:t>
+        <w:t>This section reviews three existing systems that manage final year project activity at FSKTM UTHM, which is the same domain as the proposed system. Each system is described in terms of its function and its advantages.</w:t>
+      </w:r>
+    </w:p>
+    <w:p>
+      <w:pPr>
+        <w:spacing w:line="360" w:lineRule="auto" w:before="0" w:after="0"/>
+        <w:jc w:val="both"/>
+      </w:pPr>
+      <w:r>
+        <w:rPr>
+          <w:rFonts w:ascii="Times New Roman" w:hAnsi="Times New Roman" w:eastAsia="Times New Roman"/>
+          <w:b/>
+          <w:i w:val="0"/>
+          <w:sz w:val="24"/>
+        </w:rPr>
+        <w:t>A Web-Based FSKTM FYP Management System (FFMS)</w:t>
       </w:r>
     </w:p>
     <w:p>
@@ -224,7 +284,22 @@
           <w:i w:val="0"/>
           <w:sz w:val="24"/>
         </w:rPr>
-        <w:t>The web based approach is chosen because it allows students, supervisors and coordinators to access the same record anytime and anywhere using only a browser. Web applications offer advantages of accessibility, easier maintenance and centralised data, since updates are deployed on the server and are immediately available to all users (CIO Wiki, 2023). These properties are necessary for an administrative process that involves several groups of users, because each group otherwise works from its own copy and no record is authoritative (Arumugam &amp; Abd Ishak, 2025).</w:t>
+        <w:t>The FSKTM FYP Management System was developed to streamline final year project management for final year students at FSKTM, in order to resolve time consuming manual task tracking, inefficient communication and delays in project administering (Arumugam &amp; Abd Ishak, 2025). It was developed using the waterfall methodology with detailed user acceptance testing.</w:t>
+      </w:r>
+    </w:p>
+    <w:p>
+      <w:pPr>
+        <w:spacing w:line="360" w:lineRule="auto" w:before="0" w:after="0"/>
+        <w:jc w:val="both"/>
+      </w:pPr>
+      <w:r>
+        <w:rPr>
+          <w:rFonts w:ascii="Times New Roman" w:hAnsi="Times New Roman" w:eastAsia="Times New Roman"/>
+          <w:b/>
+          <w:i w:val="0"/>
+          <w:sz w:val="24"/>
+        </w:rPr>
+        <w:t>&lt; FFMS &gt;</w:t>
       </w:r>
     </w:p>
     <w:p>
@@ -239,7 +314,172 @@
           <w:i w:val="0"/>
           <w:sz w:val="24"/>
         </w:rPr>
-        <w:t>The system also applies role based access control, which is a model for controlling access to resources where permitted actions are identified with roles rather than with individual subject identities (NIST, 2022). Role based access is important because a student, a supervisor, an examiner and a coordinator must each hold different permissions over the same PSM record (Arumugam &amp; Abd Ishak, 2025; Wan Fauzi &amp; Alduais, 2025). It also removes the need for the periodic one-to-many announcements that manual coordination relies on when it has no way of addressing a role directly (Chong Er Juan &amp; Wahid, 2021).</w:t>
+        <w:t>The function of FFMS is to provide real time progress tracking, automated deadline reminders, role based access for students, supervisors and project coordinators, and productive reporting mechanisms. The aim is to improve operational efficiency, enhance interactivity and ensure timely project completion (Arumugam &amp; Abd Ishak, 2025).</w:t>
+      </w:r>
+    </w:p>
+    <w:p>
+      <w:pPr>
+        <w:spacing w:line="360" w:lineRule="auto" w:before="0" w:after="0"/>
+        <w:jc w:val="both"/>
+      </w:pPr>
+      <w:r>
+        <w:rPr>
+          <w:rFonts w:ascii="Times New Roman" w:hAnsi="Times New Roman" w:eastAsia="Times New Roman"/>
+          <w:b w:val="0"/>
+          <w:i w:val="0"/>
+          <w:sz w:val="24"/>
+        </w:rPr>
+        <w:t>The main advantage of FFMS is that it is the closest existing system to the proposed one, because it already covers progress tracking, reminders and role based access in the same faculty. However, FFMS stops at tracking and reporting. It does not assess students, so it has no weighted rubric marking, no gated milestone approval chain across PSM 1 and PSM 2, and no mechanism to release a result only after every assessor has submitted.</w:t>
+      </w:r>
+    </w:p>
+    <w:p>
+      <w:pPr>
+        <w:spacing w:line="360" w:lineRule="auto" w:before="0" w:after="0"/>
+        <w:jc w:val="both"/>
+      </w:pPr>
+      <w:r>
+        <w:rPr>
+          <w:rFonts w:ascii="Times New Roman" w:hAnsi="Times New Roman" w:eastAsia="Times New Roman"/>
+          <w:b/>
+          <w:i w:val="0"/>
+          <w:sz w:val="24"/>
+        </w:rPr>
+        <w:t>Development of a Web-Based System for PSM Supervision</w:t>
+      </w:r>
+    </w:p>
+    <w:p>
+      <w:pPr>
+        <w:spacing w:line="360" w:lineRule="auto" w:before="0" w:after="0"/>
+        <w:jc w:val="both"/>
+      </w:pPr>
+      <w:r>
+        <w:rPr>
+          <w:rFonts w:ascii="Times New Roman" w:hAnsi="Times New Roman" w:eastAsia="Times New Roman"/>
+          <w:b w:val="0"/>
+          <w:i w:val="0"/>
+          <w:sz w:val="24"/>
+        </w:rPr>
+        <w:t>This system was developed to manage PSM supervision, allowing a student to select a potential supervisor from the system and to check the availability of that supervisor (Wan Fauzi &amp; Alduais, 2025). It was developed using the waterfall model with HTML, CSS, JavaScript and PHP, and was evaluated using test plans for each module and user acceptance testing.</w:t>
+      </w:r>
+    </w:p>
+    <w:p>
+      <w:pPr>
+        <w:spacing w:line="360" w:lineRule="auto" w:before="0" w:after="0"/>
+        <w:jc w:val="both"/>
+      </w:pPr>
+      <w:r>
+        <w:rPr>
+          <w:rFonts w:ascii="Times New Roman" w:hAnsi="Times New Roman" w:eastAsia="Times New Roman"/>
+          <w:b/>
+          <w:i w:val="0"/>
+          <w:sz w:val="24"/>
+        </w:rPr>
+        <w:t>&lt; PSM Supervision System &gt;</w:t>
+      </w:r>
+    </w:p>
+    <w:p>
+      <w:pPr>
+        <w:spacing w:line="360" w:lineRule="auto" w:before="0" w:after="0"/>
+        <w:jc w:val="both"/>
+      </w:pPr>
+      <w:r>
+        <w:rPr>
+          <w:rFonts w:ascii="Times New Roman" w:hAnsi="Times New Roman" w:eastAsia="Times New Roman"/>
+          <w:b w:val="0"/>
+          <w:i w:val="0"/>
+          <w:sz w:val="24"/>
+        </w:rPr>
+        <w:t>The function of the system is to let a supervisor track the progress of the student through the report submission features in the system. Based on the testing, the feedback from the target users showed that they were satisfied with the functionality and the interface (Wan Fauzi &amp; Alduais, 2025).</w:t>
+      </w:r>
+    </w:p>
+    <w:p>
+      <w:pPr>
+        <w:spacing w:line="360" w:lineRule="auto" w:before="0" w:after="0"/>
+        <w:jc w:val="both"/>
+      </w:pPr>
+      <w:r>
+        <w:rPr>
+          <w:rFonts w:ascii="Times New Roman" w:hAnsi="Times New Roman" w:eastAsia="Times New Roman"/>
+          <w:b w:val="0"/>
+          <w:i w:val="0"/>
+          <w:sz w:val="24"/>
+        </w:rPr>
+        <w:t>The main advantage of this system is that it handles the student to supervisor matching stage that PSM begins with, and its authors name real time chat between student and supervisor as future work. However, it covers only supervision and report submission. It does not enforce supervision capacity, does not manage title registration or panel decisions, and performs no rubric based assessment.</w:t>
+      </w:r>
+    </w:p>
+    <w:p>
+      <w:pPr>
+        <w:spacing w:line="360" w:lineRule="auto" w:before="0" w:after="0"/>
+        <w:jc w:val="both"/>
+      </w:pPr>
+      <w:r>
+        <w:rPr>
+          <w:rFonts w:ascii="Times New Roman" w:hAnsi="Times New Roman" w:eastAsia="Times New Roman"/>
+          <w:b/>
+          <w:i w:val="0"/>
+          <w:sz w:val="24"/>
+        </w:rPr>
+        <w:t>Final Year Project Supervisor Selection System for FSKTM, UTHM</w:t>
+      </w:r>
+    </w:p>
+    <w:p>
+      <w:pPr>
+        <w:spacing w:line="360" w:lineRule="auto" w:before="0" w:after="0"/>
+        <w:jc w:val="both"/>
+      </w:pPr>
+      <w:r>
+        <w:rPr>
+          <w:rFonts w:ascii="Times New Roman" w:hAnsi="Times New Roman" w:eastAsia="Times New Roman"/>
+          <w:b w:val="0"/>
+          <w:i w:val="0"/>
+          <w:sz w:val="24"/>
+        </w:rPr>
+        <w:t>This system was developed because the selection of a suitable supervisor is a crucial starting point for a final year project, yet FSKTM still relied on manual selection methods that were time consuming and produced mismatches between student research and supervisor expertise (Tam &amp; Abdullah, 2025). It was developed using the agile methodology in a client server structure.</w:t>
+      </w:r>
+    </w:p>
+    <w:p>
+      <w:pPr>
+        <w:spacing w:line="360" w:lineRule="auto" w:before="0" w:after="0"/>
+        <w:jc w:val="both"/>
+      </w:pPr>
+      <w:r>
+        <w:rPr>
+          <w:rFonts w:ascii="Times New Roman" w:hAnsi="Times New Roman" w:eastAsia="Times New Roman"/>
+          <w:b/>
+          <w:i w:val="0"/>
+          <w:sz w:val="24"/>
+        </w:rPr>
+        <w:t>&lt; FYP Supervisor Selection System &gt;</w:t>
+      </w:r>
+    </w:p>
+    <w:p>
+      <w:pPr>
+        <w:spacing w:line="360" w:lineRule="auto" w:before="0" w:after="0"/>
+        <w:jc w:val="both"/>
+      </w:pPr>
+      <w:r>
+        <w:rPr>
+          <w:rFonts w:ascii="Times New Roman" w:hAnsi="Times New Roman" w:eastAsia="Times New Roman"/>
+          <w:b w:val="0"/>
+          <w:i w:val="0"/>
+          <w:sz w:val="24"/>
+        </w:rPr>
+        <w:t>The function of the system is to handle the student's application request and the supervisor's response, while simplifying the process of finding a supervisor. It also helps the faculty coordinator monitor the latest supervisor and student matching information (Tam &amp; Abdullah, 2025).</w:t>
+      </w:r>
+    </w:p>
+    <w:p>
+      <w:pPr>
+        <w:spacing w:line="360" w:lineRule="auto" w:before="0" w:after="0"/>
+        <w:jc w:val="both"/>
+      </w:pPr>
+      <w:r>
+        <w:rPr>
+          <w:rFonts w:ascii="Times New Roman" w:hAnsi="Times New Roman" w:eastAsia="Times New Roman"/>
+          <w:b w:val="0"/>
+          <w:i w:val="0"/>
+          <w:sz w:val="24"/>
+        </w:rPr>
+        <w:t>The main advantage of this system is that it makes the matching stage systematic and gives the coordinator visibility of who is paired with whom. However, it addresses only one step of the PSM lifecycle. Once a supervisor is selected, the system has nothing further to offer: it does not track milestones, manage submissions, or assess students against the official rubrics.</w:t>
       </w:r>
     </w:p>
     <w:p>
@@ -268,275 +508,6 @@
           <w:i w:val="0"/>
           <w:sz w:val="24"/>
         </w:rPr>
-        <w:t>Study of Existing Related Systems</w:t>
-      </w:r>
-    </w:p>
-    <w:p>
-      <w:pPr>
-        <w:spacing w:line="360" w:lineRule="auto" w:before="0" w:after="0"/>
-        <w:jc w:val="both"/>
-      </w:pPr>
-      <w:r>
-        <w:rPr>
-          <w:rFonts w:ascii="Times New Roman" w:hAnsi="Times New Roman" w:eastAsia="Times New Roman"/>
-          <w:b w:val="0"/>
-          <w:i w:val="0"/>
-          <w:sz w:val="24"/>
-        </w:rPr>
-        <w:t>This section reviews three existing systems that manage final year project activity at FSKTM UTHM, which is the same domain as the proposed system. Each system is described in terms of its function and its advantages.</w:t>
-      </w:r>
-    </w:p>
-    <w:p>
-      <w:pPr>
-        <w:spacing w:line="360" w:lineRule="auto" w:before="0" w:after="0"/>
-        <w:jc w:val="both"/>
-      </w:pPr>
-      <w:r>
-        <w:rPr>
-          <w:rFonts w:ascii="Times New Roman" w:hAnsi="Times New Roman" w:eastAsia="Times New Roman"/>
-          <w:b/>
-          <w:i w:val="0"/>
-          <w:sz w:val="24"/>
-        </w:rPr>
-        <w:t>A Web-Based FSKTM FYP Management System (FFMS)</w:t>
-      </w:r>
-    </w:p>
-    <w:p>
-      <w:pPr>
-        <w:spacing w:line="360" w:lineRule="auto" w:before="0" w:after="0"/>
-        <w:jc w:val="both"/>
-      </w:pPr>
-      <w:r>
-        <w:rPr>
-          <w:rFonts w:ascii="Times New Roman" w:hAnsi="Times New Roman" w:eastAsia="Times New Roman"/>
-          <w:b w:val="0"/>
-          <w:i w:val="0"/>
-          <w:sz w:val="24"/>
-        </w:rPr>
-        <w:t>The FSKTM FYP Management System was developed to streamline final year project management for final year students at FSKTM, in order to resolve time consuming manual task tracking, inefficient communication and delays in project administering (Arumugam &amp; Abd Ishak, 2025). It was developed using the waterfall methodology with detailed user acceptance testing.</w:t>
-      </w:r>
-    </w:p>
-    <w:p>
-      <w:pPr>
-        <w:spacing w:line="360" w:lineRule="auto" w:before="0" w:after="0"/>
-        <w:jc w:val="both"/>
-      </w:pPr>
-      <w:r>
-        <w:rPr>
-          <w:rFonts w:ascii="Times New Roman" w:hAnsi="Times New Roman" w:eastAsia="Times New Roman"/>
-          <w:b/>
-          <w:i w:val="0"/>
-          <w:sz w:val="24"/>
-        </w:rPr>
-        <w:t>&lt; FFMS &gt;</w:t>
-      </w:r>
-    </w:p>
-    <w:p>
-      <w:pPr>
-        <w:spacing w:line="360" w:lineRule="auto" w:before="0" w:after="0"/>
-        <w:jc w:val="both"/>
-      </w:pPr>
-      <w:r>
-        <w:rPr>
-          <w:rFonts w:ascii="Times New Roman" w:hAnsi="Times New Roman" w:eastAsia="Times New Roman"/>
-          <w:b w:val="0"/>
-          <w:i w:val="0"/>
-          <w:sz w:val="24"/>
-        </w:rPr>
-        <w:t>The function of FFMS is to provide real time progress tracking, automated deadline reminders, role based access for students, supervisors and project coordinators, and productive reporting mechanisms. The aim is to improve operational efficiency, enhance interactivity and ensure timely project completion (Arumugam &amp; Abd Ishak, 2025).</w:t>
-      </w:r>
-    </w:p>
-    <w:p>
-      <w:pPr>
-        <w:spacing w:line="360" w:lineRule="auto" w:before="0" w:after="0"/>
-        <w:jc w:val="both"/>
-      </w:pPr>
-      <w:r>
-        <w:rPr>
-          <w:rFonts w:ascii="Times New Roman" w:hAnsi="Times New Roman" w:eastAsia="Times New Roman"/>
-          <w:b w:val="0"/>
-          <w:i w:val="0"/>
-          <w:sz w:val="24"/>
-        </w:rPr>
-        <w:t>The main advantage of FFMS is that it is the closest existing system to the proposed one, because it already covers progress tracking, reminders and role based access in the same faculty. However, FFMS stops at tracking and reporting. It does not assess students, so it has no weighted rubric marking, no gated milestone approval chain across PSM 1 and PSM 2, and no mechanism to release a result only after every assessor has submitted.</w:t>
-      </w:r>
-    </w:p>
-    <w:p>
-      <w:pPr>
-        <w:spacing w:line="360" w:lineRule="auto" w:before="0" w:after="0"/>
-        <w:jc w:val="both"/>
-      </w:pPr>
-      <w:r>
-        <w:rPr>
-          <w:rFonts w:ascii="Times New Roman" w:hAnsi="Times New Roman" w:eastAsia="Times New Roman"/>
-          <w:b/>
-          <w:i w:val="0"/>
-          <w:sz w:val="24"/>
-        </w:rPr>
-        <w:t>Development of a Web-Based System for PSM Supervision</w:t>
-      </w:r>
-    </w:p>
-    <w:p>
-      <w:pPr>
-        <w:spacing w:line="360" w:lineRule="auto" w:before="0" w:after="0"/>
-        <w:jc w:val="both"/>
-      </w:pPr>
-      <w:r>
-        <w:rPr>
-          <w:rFonts w:ascii="Times New Roman" w:hAnsi="Times New Roman" w:eastAsia="Times New Roman"/>
-          <w:b w:val="0"/>
-          <w:i w:val="0"/>
-          <w:sz w:val="24"/>
-        </w:rPr>
-        <w:t>This system was developed to manage PSM supervision, allowing a student to select a potential supervisor from the system and to check the availability of that supervisor (Wan Fauzi &amp; Alduais, 2025). It was developed using the waterfall model with HTML, CSS, JavaScript and PHP, and was evaluated using test plans for each module and user acceptance testing.</w:t>
-      </w:r>
-    </w:p>
-    <w:p>
-      <w:pPr>
-        <w:spacing w:line="360" w:lineRule="auto" w:before="0" w:after="0"/>
-        <w:jc w:val="both"/>
-      </w:pPr>
-      <w:r>
-        <w:rPr>
-          <w:rFonts w:ascii="Times New Roman" w:hAnsi="Times New Roman" w:eastAsia="Times New Roman"/>
-          <w:b/>
-          <w:i w:val="0"/>
-          <w:sz w:val="24"/>
-        </w:rPr>
-        <w:t>&lt; PSM Supervision System &gt;</w:t>
-      </w:r>
-    </w:p>
-    <w:p>
-      <w:pPr>
-        <w:spacing w:line="360" w:lineRule="auto" w:before="0" w:after="0"/>
-        <w:jc w:val="both"/>
-      </w:pPr>
-      <w:r>
-        <w:rPr>
-          <w:rFonts w:ascii="Times New Roman" w:hAnsi="Times New Roman" w:eastAsia="Times New Roman"/>
-          <w:b w:val="0"/>
-          <w:i w:val="0"/>
-          <w:sz w:val="24"/>
-        </w:rPr>
-        <w:t>The function of the system is to let a supervisor track the progress of the student through the report submission features in the system. Based on the testing, the feedback from the target users showed that they were satisfied with the functionality and the interface (Wan Fauzi &amp; Alduais, 2025).</w:t>
-      </w:r>
-    </w:p>
-    <w:p>
-      <w:pPr>
-        <w:spacing w:line="360" w:lineRule="auto" w:before="0" w:after="0"/>
-        <w:jc w:val="both"/>
-      </w:pPr>
-      <w:r>
-        <w:rPr>
-          <w:rFonts w:ascii="Times New Roman" w:hAnsi="Times New Roman" w:eastAsia="Times New Roman"/>
-          <w:b w:val="0"/>
-          <w:i w:val="0"/>
-          <w:sz w:val="24"/>
-        </w:rPr>
-        <w:t>The main advantage of this system is that it handles the student to supervisor matching stage that PSM begins with, and its authors name real time chat between student and supervisor as future work. However, it covers only supervision and report submission. It does not enforce supervision capacity, does not manage title registration or panel decisions, and performs no rubric based assessment.</w:t>
-      </w:r>
-    </w:p>
-    <w:p>
-      <w:pPr>
-        <w:spacing w:line="360" w:lineRule="auto" w:before="0" w:after="0"/>
-        <w:jc w:val="both"/>
-      </w:pPr>
-      <w:r>
-        <w:rPr>
-          <w:rFonts w:ascii="Times New Roman" w:hAnsi="Times New Roman" w:eastAsia="Times New Roman"/>
-          <w:b/>
-          <w:i w:val="0"/>
-          <w:sz w:val="24"/>
-        </w:rPr>
-        <w:t>Final Year Project Supervisor Selection System for FSKTM, UTHM</w:t>
-      </w:r>
-    </w:p>
-    <w:p>
-      <w:pPr>
-        <w:spacing w:line="360" w:lineRule="auto" w:before="0" w:after="0"/>
-        <w:jc w:val="both"/>
-      </w:pPr>
-      <w:r>
-        <w:rPr>
-          <w:rFonts w:ascii="Times New Roman" w:hAnsi="Times New Roman" w:eastAsia="Times New Roman"/>
-          <w:b w:val="0"/>
-          <w:i w:val="0"/>
-          <w:sz w:val="24"/>
-        </w:rPr>
-        <w:t>This system was developed because the selection of a suitable supervisor is a crucial starting point for a final year project, yet FSKTM still relied on manual selection methods that were time consuming and produced mismatches between student research and supervisor expertise (Tam &amp; Abdullah, 2025). It was developed using the agile methodology in a client server structure.</w:t>
-      </w:r>
-    </w:p>
-    <w:p>
-      <w:pPr>
-        <w:spacing w:line="360" w:lineRule="auto" w:before="0" w:after="0"/>
-        <w:jc w:val="both"/>
-      </w:pPr>
-      <w:r>
-        <w:rPr>
-          <w:rFonts w:ascii="Times New Roman" w:hAnsi="Times New Roman" w:eastAsia="Times New Roman"/>
-          <w:b/>
-          <w:i w:val="0"/>
-          <w:sz w:val="24"/>
-        </w:rPr>
-        <w:t>&lt; FYP Supervisor Selection System &gt;</w:t>
-      </w:r>
-    </w:p>
-    <w:p>
-      <w:pPr>
-        <w:spacing w:line="360" w:lineRule="auto" w:before="0" w:after="0"/>
-        <w:jc w:val="both"/>
-      </w:pPr>
-      <w:r>
-        <w:rPr>
-          <w:rFonts w:ascii="Times New Roman" w:hAnsi="Times New Roman" w:eastAsia="Times New Roman"/>
-          <w:b w:val="0"/>
-          <w:i w:val="0"/>
-          <w:sz w:val="24"/>
-        </w:rPr>
-        <w:t>The function of the system is to handle the student's application request and the supervisor's response, while simplifying the process of finding a supervisor. It also helps the faculty coordinator monitor the latest supervisor and student matching information (Tam &amp; Abdullah, 2025).</w:t>
-      </w:r>
-    </w:p>
-    <w:p>
-      <w:pPr>
-        <w:spacing w:line="360" w:lineRule="auto" w:before="0" w:after="0"/>
-        <w:jc w:val="both"/>
-      </w:pPr>
-      <w:r>
-        <w:rPr>
-          <w:rFonts w:ascii="Times New Roman" w:hAnsi="Times New Roman" w:eastAsia="Times New Roman"/>
-          <w:b w:val="0"/>
-          <w:i w:val="0"/>
-          <w:sz w:val="24"/>
-        </w:rPr>
-        <w:t>The main advantage of this system is that it makes the matching stage systematic and gives the coordinator visibility of who is paired with whom. However, it addresses only one step of the PSM lifecycle. Once a supervisor is selected, the system has nothing further to offer: it does not track milestones, manage submissions, or assess students against the official rubrics.</w:t>
-      </w:r>
-    </w:p>
-    <w:p>
-      <w:pPr>
-        <w:numPr>
-          <w:ilvl w:val="0"/>
-          <w:numId w:val="0"/>
-        </w:numPr>
-        <w:pStyle w:val="Heading2"/>
-        <w:spacing w:before="240" w:after="240"/>
-      </w:pPr>
-      <w:r>
-        <w:rPr>
-          <w:rFonts w:ascii="Times New Roman" w:hAnsi="Times New Roman" w:eastAsia="Times New Roman"/>
-          <w:b/>
-          <w:i w:val="0"/>
-          <w:sz w:val="24"/>
-        </w:rPr>
-        <w:t>2.5</w:t>
-        <w:tab/>
-      </w:r>
-      <w:r>
-        <w:rPr>
-          <w:rFonts w:ascii="Times New Roman" w:hAnsi="Times New Roman" w:eastAsia="Times New Roman"/>
-          <w:b/>
-          <w:i w:val="0"/>
-          <w:sz w:val="24"/>
-        </w:rPr>
         <w:t>Your Proposed System</w:t>
       </w:r>
     </w:p>
@@ -601,7 +572,7 @@
           <w:i w:val="0"/>
           <w:sz w:val="24"/>
         </w:rPr>
-        <w:t>2.6</w:t>
+        <w:t>2.5</w:t>
         <w:tab/>
       </w:r>
       <w:r>
@@ -2250,7 +2221,7 @@
           <w:i w:val="0"/>
           <w:sz w:val="24"/>
         </w:rPr>
-        <w:t>2.7</w:t>
+        <w:t>2.6</w:t>
         <w:tab/>
       </w:r>
       <w:r>

</xml_diff>